<commit_message>
Répertoire des joueurs : colonne Club triable + saisie du club à l'ajout
- roster.py : chaque entrée devient {name, club} (migration automatique
  de l'ancien format liste de noms). Nouvelles fonctions : get_club,
  set_club, list_clubs, load_roster_entries/save_roster_entries.
  add_to_roster et rename_in_roster préservent/mettent à jour le club.
- Fenêtre Répertoire : tableau Nom/Club triable en cliquant sur les
  en-têtes (comme l'onglet Joueurs), bouton 'Modifier le club...', et
  vignette photo décalée vers le bas (ne mord plus sur le haut de la
  fenêtre).
- Onglet Joueurs : champ Club (menu déroulant des clubs connus + saisie
  libre) à côté du nom lors de l'ajout, pré-rempli automatiquement pour
  un joueur déjà connu du répertoire ; respecte la case Temp.
- LISEZMOI.md et MANUEL_UTILISATEUR.docx mis à jour en conséquence (le
  manuel a aussi été complété avec la case Temp, qui manquait).

Co-Authored-By: Claude Sonnet 5 <noreply@anthropic.com>
</commit_message>
<xml_diff>
--- a/MANUEL_UTILISATEUR.docx
+++ b/MANUEL_UTILISATEUR.docx
@@ -643,6 +643,34 @@
           <w:i w:val="0"/>
         </w:rPr>
         <w:t>Saisissez le nom dans le champ en haut et cliquez sur « Ajouter » (ou touche Entrée). Le joueur est automatiquement placé à la table la moins remplie, sur le premier siège libre.</w:t>
+      </w:r>
+    </w:p>
+    <w:p>
+      <w:pPr>
+        <w:pStyle w:val="ListBullet"/>
+      </w:pPr>
+      <w:r>
+        <w:rPr>
+          <w:b/>
+        </w:rPr>
+        <w:t xml:space="preserve">Club — </w:t>
+      </w:r>
+      <w:r>
+        <w:t>menu déroulant à côté du nom, proposant les clubs déjà connus du répertoire (voir section 12) ; on peut aussi taper directement un club inédit. Il se pré-remplit automatiquement si le nom saisi correspond à un joueur déjà présent dans le répertoire.</w:t>
+      </w:r>
+    </w:p>
+    <w:p>
+      <w:pPr>
+        <w:pStyle w:val="ListBullet"/>
+      </w:pPr>
+      <w:r>
+        <w:rPr>
+          <w:b/>
+        </w:rPr>
+        <w:t xml:space="preserve">Temp (ne pas ajouter au répertoire) — </w:t>
+      </w:r>
+      <w:r>
+        <w:t>case à cocher avant l'ajout : le joueur est inscrit normalement au tournoi, mais ni son nom ni son club ne sont sauvegardés dans le répertoire de joueurs habituels — utile pour un invité ponctuel.</w:t>
       </w:r>
     </w:p>
     <w:p>
@@ -1665,6 +1693,14 @@
       </w:r>
     </w:p>
     <w:p>
+      <w:r>
+        <w:rPr>
+          <w:i w:val="0"/>
+        </w:rPr>
+        <w:t>Les joueurs sont affichés dans un tableau à deux colonnes, Nom et Club. Cliquer sur l'un ou l'autre en-tête trie la liste en conséquence ; cliquer une seconde fois inverse l'ordre (croissant/décroissant).</w:t>
+      </w:r>
+    </w:p>
+    <w:p>
       <w:pPr>
         <w:pStyle w:val="ListBullet"/>
       </w:pPr>
@@ -1676,6 +1712,20 @@
       </w:r>
       <w:r>
         <w:t>gestion de la liste elle-même.</w:t>
+      </w:r>
+    </w:p>
+    <w:p>
+      <w:pPr>
+        <w:pStyle w:val="ListBullet"/>
+      </w:pPr>
+      <w:r>
+        <w:rPr>
+          <w:b/>
+        </w:rPr>
+        <w:t xml:space="preserve">Modifier le club... — </w:t>
+      </w:r>
+      <w:r>
+        <w:t>renseigne ou corrige le club du joueur sélectionné, via la même liste déroulante (clubs déjà connus, ou saisie libre) que dans l'onglet Joueurs.</w:t>
       </w:r>
     </w:p>
     <w:p>

</xml_diff>

<commit_message>
Documente l'auto-complétion du nom de joueur
LISEZMOI.md, MANUEL_UTILISATEUR.docx et MANUEL_UTILISATEUR_TOURNOI_CPC.docx
(édition XML ciblée pour ce dernier, comme précédemment, afin de
préserver vos modifications personnelles) décrivent désormais la
liste déroulante d'auto-complétion du champ Nom du joueur.

Co-Authored-By: Claude Sonnet 5 <noreply@anthropic.com>
</commit_message>
<xml_diff>
--- a/MANUEL_UTILISATEUR.docx
+++ b/MANUEL_UTILISATEUR.docx
@@ -643,6 +643,20 @@
           <w:i w:val="0"/>
         </w:rPr>
         <w:t>Saisissez le nom dans le champ en haut et cliquez sur « Ajouter » (ou touche Entrée). Le joueur est automatiquement placé à la table la moins remplie, sur le premier siège libre.</w:t>
+      </w:r>
+    </w:p>
+    <w:p>
+      <w:pPr>
+        <w:pStyle w:val="ListBullet"/>
+      </w:pPr>
+      <w:r>
+        <w:rPr>
+          <w:b/>
+        </w:rPr>
+        <w:t xml:space="preserve">Auto-complétion du nom — </w:t>
+      </w:r>
+      <w:r>
+        <w:t>dès la première lettre tapée, une liste déroulante propose les joueurs du répertoire dont le nom correspond (déjà inscrits au tournoi exclus) ; cliquer une suggestion inscrit le joueur immédiatement, sans passer par le bouton « Ajouter ».</w:t>
       </w:r>
     </w:p>
     <w:p>

</xml_diff>